<commit_message>
Security Scanner: manual §6.4 — sensitive credential disclosure + encrypted export
Documents the tiered credential disclosure (deck = counts, broker = masked
examples, full report = enumerated/masked, no passwords anywhere in rendered
output) and the on-request encrypted export workflow: age public-key encryption
+ one-time expiring link, gated behind a signed consent form, generated on
demand by re-querying DeHashed (never stored). Includes the operator workflow,
a client setup/retrieve/decrypt guide (age-keygen → share public key → age -d),
the AES-256 passphrase fallback, and why public-key beats a shared secret.

Co-Authored-By: Claude Opus 4.7 <noreply@anthropic.com>
</commit_message>
<xml_diff>
--- a/security_scanner/Phishield_Cyber_Risk_Scanner_User_Manual.docx
+++ b/security_scanner/Phishield_Cyber_Risk_Scanner_User_Manual.docx
@@ -12045,6 +12045,274 @@
       </w:pPr>
       <w:r>
         <w:t>The compliance framework mapping in the report is based solely on externally observable indicators. It does not constitute a formal compliance assessment or audit. Many compliance requirements relate to internal controls, policies, and processes that cannot be evaluated through external scanning alone. Organisations should engage qualified auditors for formal compliance assessments.</w:t>
+      </w:r>
+    </w:p>
+    <w:p>
+      <w:pPr>
+        <w:keepNext/>
+        <w:spacing w:before="200" w:after="60"/>
+      </w:pPr>
+      <w:r>
+        <w:rPr>
+          <w:b/>
+          <w:color w:val="003366"/>
+          <w:sz w:val="26"/>
+        </w:rPr>
+        <w:t>6.4 Sensitive Credential Disclosure &amp; Encrypted Export</w:t>
+      </w:r>
+    </w:p>
+    <w:p>
+      <w:pPr>
+        <w:widowControl/>
+        <w:spacing w:after="80"/>
+      </w:pPr>
+      <w:r>
+        <w:t>The scanner surfaces leaked credentials (DeHashed), active infostealer infections (Hudson Rock, with infection dates), and dark-web / forum circulation (IntelX or replacement). Because this is sensitive personal information, it is disclosed in TIERS by audience, and the complete unmasked detail — including the actual passwords — is delivered only on request, with the client's signed consent, as an encrypted file. This exposure is already circulating in the public / criminal domain; the scanner re-surfaces it solely so the organisation can remediate (force resets, enforce MFA).</w:t>
+      </w:r>
+    </w:p>
+    <w:p>
+      <w:pPr>
+        <w:widowControl/>
+        <w:spacing w:after="80"/>
+      </w:pPr>
+      <w:r>
+        <w:rPr>
+          <w:b/>
+        </w:rPr>
+        <w:t xml:space="preserve">Tiered disclosure: </w:t>
+      </w:r>
+      <w:r>
+        <w:t>what each output shows.</w:t>
+      </w:r>
+    </w:p>
+    <w:p>
+      <w:pPr>
+        <w:pStyle w:val="ListParagraph"/>
+        <w:widowControl/>
+        <w:spacing w:after="40"/>
+      </w:pPr>
+      <w:r>
+        <w:t>Executive Deck — counts only (number of exposed accounts, infected devices, services). No identifiers.</w:t>
+      </w:r>
+    </w:p>
+    <w:p>
+      <w:pPr>
+        <w:pStyle w:val="ListParagraph"/>
+        <w:widowControl/>
+        <w:spacing w:after="40"/>
+      </w:pPr>
+      <w:r>
+        <w:t>Broker Summary — 2-3 partially-masked example accounts / services plus summarised counts. No passwords.</w:t>
+      </w:r>
+    </w:p>
+    <w:p>
+      <w:pPr>
+        <w:pStyle w:val="ListParagraph"/>
+        <w:widowControl/>
+        <w:spacing w:after="40"/>
+      </w:pPr>
+      <w:r>
+        <w:t>Full Technical Report — enumerated, partially-masked accounts, a per-service summary, infection dates, and stealer families. No passwords.</w:t>
+      </w:r>
+    </w:p>
+    <w:p>
+      <w:pPr>
+        <w:pStyle w:val="ListParagraph"/>
+        <w:widowControl/>
+        <w:spacing w:after="40"/>
+      </w:pPr>
+      <w:r>
+        <w:t>Encrypted Credential Export (on request) — the complete list INCLUDING actual passwords, delivered as an encrypted file after signed client consent. Never stored on the scanner; generated on demand.</w:t>
+      </w:r>
+    </w:p>
+    <w:p>
+      <w:pPr>
+        <w:widowControl/>
+        <w:spacing w:after="80"/>
+      </w:pPr>
+      <w:r>
+        <w:t>Masking uses a partial reveal (first two plus last character of the local part, e.g. 'jo***n@example.com') so the organisation can recognise its own accounts — demonstrating the findings are real — while an outsider cannot reconstruct them.</w:t>
+      </w:r>
+    </w:p>
+    <w:p>
+      <w:pPr>
+        <w:widowControl/>
+        <w:spacing w:after="80"/>
+      </w:pPr>
+      <w:r>
+        <w:rPr>
+          <w:b/>
+        </w:rPr>
+        <w:t xml:space="preserve">Operator workflow (broker / scanner user): </w:t>
+      </w:r>
+      <w:r/>
+    </w:p>
+    <w:p>
+      <w:pPr>
+        <w:pStyle w:val="ListParagraph"/>
+        <w:widowControl/>
+        <w:spacing w:after="40"/>
+      </w:pPr>
+      <w:r>
+        <w:t>1. Obtain the client's SIGNED CONSENT form and upload it — this is the authorisation gate and the FAIS / POPIA audit trail.</w:t>
+      </w:r>
+    </w:p>
+    <w:p>
+      <w:pPr>
+        <w:pStyle w:val="ListParagraph"/>
+        <w:widowControl/>
+        <w:spacing w:after="40"/>
+      </w:pPr>
+      <w:r>
+        <w:t>2. Obtain the client's age PUBLIC key (the client generates it — see below). A public key is safe to share openly.</w:t>
+      </w:r>
+    </w:p>
+    <w:p>
+      <w:pPr>
+        <w:pStyle w:val="ListParagraph"/>
+        <w:widowControl/>
+        <w:spacing w:after="40"/>
+      </w:pPr>
+      <w:r>
+        <w:t>3. Trigger the export. The scanner re-queries DeHashed at that moment, builds the CSV, and encrypts it to the client's public key with age. No passwords are written to the scanner database.</w:t>
+      </w:r>
+    </w:p>
+    <w:p>
+      <w:pPr>
+        <w:pStyle w:val="ListParagraph"/>
+        <w:widowControl/>
+        <w:spacing w:after="40"/>
+      </w:pPr>
+      <w:r>
+        <w:t>4. Share the one-time, expiring download link with the client. The encrypted file is deleted after download or expiry.</w:t>
+      </w:r>
+    </w:p>
+    <w:p>
+      <w:pPr>
+        <w:pStyle w:val="ListParagraph"/>
+        <w:widowControl/>
+        <w:spacing w:after="40"/>
+      </w:pPr>
+      <w:r>
+        <w:t>5. Fallback if the client cannot use age keys: the scanner produces an AES-256 password-protected file; send the passphrase via a SEPARATE secure channel (never the same channel as the link).</w:t>
+      </w:r>
+    </w:p>
+    <w:p>
+      <w:pPr>
+        <w:widowControl/>
+        <w:spacing w:after="80"/>
+      </w:pPr>
+      <w:r>
+        <w:rPr>
+          <w:b/>
+        </w:rPr>
+        <w:t xml:space="preserve">Client guide — one-time setup (age, recommended): </w:t>
+      </w:r>
+      <w:r/>
+    </w:p>
+    <w:p>
+      <w:pPr>
+        <w:pStyle w:val="ListParagraph"/>
+        <w:widowControl/>
+        <w:spacing w:after="40"/>
+      </w:pPr>
+      <w:r>
+        <w:t>Install age (a small, free, cross-platform tool: github.com/FiloSottile/age).</w:t>
+      </w:r>
+    </w:p>
+    <w:p>
+      <w:pPr>
+        <w:pStyle w:val="ListParagraph"/>
+        <w:widowControl/>
+        <w:spacing w:after="40"/>
+      </w:pPr>
+      <w:r>
+        <w:t>Generate a keypair: run 'age-keygen -o key.txt'. This prints your PUBLIC key (starts with 'age1...') and writes your PRIVATE key to key.txt.</w:t>
+      </w:r>
+    </w:p>
+    <w:p>
+      <w:pPr>
+        <w:pStyle w:val="ListParagraph"/>
+        <w:widowControl/>
+        <w:spacing w:after="40"/>
+      </w:pPr>
+      <w:r>
+        <w:t>Send ONLY the public key (the 'age1...' line) to your broker. Keep key.txt (the private key) secret and backed up — without it the file cannot be opened.</w:t>
+      </w:r>
+    </w:p>
+    <w:p>
+      <w:pPr>
+        <w:widowControl/>
+        <w:spacing w:after="80"/>
+      </w:pPr>
+      <w:r>
+        <w:rPr>
+          <w:b/>
+        </w:rPr>
+        <w:t xml:space="preserve">Client guide — retrieve &amp; decrypt: </w:t>
+      </w:r>
+      <w:r/>
+    </w:p>
+    <w:p>
+      <w:pPr>
+        <w:pStyle w:val="ListParagraph"/>
+        <w:widowControl/>
+        <w:spacing w:after="40"/>
+      </w:pPr>
+      <w:r>
+        <w:t>Open the one-time link within its expiry window and download the '.age' file.</w:t>
+      </w:r>
+    </w:p>
+    <w:p>
+      <w:pPr>
+        <w:pStyle w:val="ListParagraph"/>
+        <w:widowControl/>
+        <w:spacing w:after="40"/>
+      </w:pPr>
+      <w:r>
+        <w:t>Decrypt: 'age -d -i key.txt -o credentials.csv credentials.csv.age'. The result is the plain CSV.</w:t>
+      </w:r>
+    </w:p>
+    <w:p>
+      <w:pPr>
+        <w:pStyle w:val="ListParagraph"/>
+        <w:widowControl/>
+        <w:spacing w:after="40"/>
+      </w:pPr>
+      <w:r>
+        <w:t>AES fallback: receive the passphrase from your broker via a separate channel, then open the file with 7-Zip (AES-256) or 'openssl enc -d -aes-256-cbc -in file.enc -out credentials.csv'.</w:t>
+      </w:r>
+    </w:p>
+    <w:p>
+      <w:pPr>
+        <w:widowControl/>
+        <w:spacing w:after="80"/>
+      </w:pPr>
+      <w:r>
+        <w:rPr>
+          <w:b/>
+          <w:color w:val="B40000"/>
+        </w:rPr>
+        <w:t xml:space="preserve">WARNING: </w:t>
+      </w:r>
+      <w:r>
+        <w:t>The encrypted export contains live passwords — treat it like any breach dump. Decrypt only on a secure workstation, action the password resets and MFA enrolment, then securely delete the file. The scanner itself never stores passwords, and none of the rendered reports (deck, broker summary, full report) ever contain passwords.</w:t>
+      </w:r>
+    </w:p>
+    <w:p>
+      <w:pPr>
+        <w:widowControl/>
+        <w:spacing w:after="80"/>
+      </w:pPr>
+      <w:r>
+        <w:rPr>
+          <w:b/>
+          <w:color w:val="003399"/>
+        </w:rPr>
+        <w:t xml:space="preserve">NOTE: </w:t>
+      </w:r>
+      <w:r>
+        <w:t>Why public-key (age) over a shared password: with age, only the client's private key — which never leaves them — can decrypt the file, so there is no secret to intercept in transit. A shared AES passphrase is offered only as a fallback and must travel on a channel separate from the file.</w:t>
       </w:r>
     </w:p>
     <w:p>

</xml_diff>

<commit_message>
docs: update user manual for Waves 1-6 behavioural changes
Sync the §4.x checker descriptions to current behaviour (not the bugs; not the pending
calibration): HTTP-headers "could not assess (blocked/unreachable)"; WAF detection from
headers/cookies/Server only + F5 genuine markers; DKIM requires v=DKIM1/p=; per-IP port
attribution + DNSSEC/AAAA/TXT surfaced; VPN genuine-marker+200 for all 8 vendors; DNSBL
return-code validation + SORBS removed; Exposed-Admin 200+body-only (401/403=protected);
Subdomains crt.sh-primary + wildcard guard + honest CT narration; CVE ASN/geo "not
available" + OSV estimated; Credential Risk counts password-bearing records; typosquat
IDN/punycode; CMS genuine WP fingerprint + readme body-check; EOL boundary-anchored.
Manual docx rebuilt (blank-page gate passed).

Co-Authored-By: Claude Opus 4.7 <noreply@anthropic.com>
</commit_message>
<xml_diff>
--- a/security_scanner/Phishield_Cyber_Risk_Scanner_User_Manual.docx
+++ b/security_scanner/Phishield_Cyber_Risk_Scanner_User_Manual.docx
@@ -3157,6 +3157,22 @@
     </w:p>
     <w:p>
       <w:pPr>
+        <w:widowControl/>
+        <w:spacing w:after="80"/>
+      </w:pPr>
+      <w:r>
+        <w:rPr>
+          <w:b/>
+          <w:color w:val="003399"/>
+        </w:rPr>
+        <w:t xml:space="preserve">NOTE: </w:t>
+      </w:r>
+      <w:r>
+        <w:t>Blocked or unreachable responses: if the final response to the scanner is not a success (2xx) status — for example, a WAF or CDN returns a 403 or 503 challenge/block page to the scanner's user agent — the headers on that block page do not represent the site's real configuration. In that case the check reports 'could not assess (blocked/unreachable)' and emits no header score, and scoring and remediation fall back to neutral, rather than recording every security header as missing. The renderers show this as an amber, non-penalising card.</w:t>
+      </w:r>
+    </w:p>
+    <w:p>
+      <w:pPr>
         <w:keepNext/>
         <w:spacing w:before="200" w:after="60"/>
       </w:pPr>
@@ -3181,7 +3197,7 @@
         <w:t xml:space="preserve">What it checks:  </w:t>
       </w:r>
       <w:r>
-        <w:t>The scanner sends an HTTPS request to the domain and examines the response for signatures that indicate a Web Application Firewall (WAF) or DDoS protection service is in place. Detection is based on three categories of evidence: HTTP response headers unique to the WAF vendor, cookies set by the WAF, and characteristic content in the response body.</w:t>
+        <w:t>The scanner sends an HTTPS request to the domain and examines the response for signatures that indicate a Web Application Firewall (WAF) or DDoS protection service is in place. Detection is based strictly on transport-layer evidence: HTTP response headers unique to the WAF vendor, cookies set by the WAF, and the Server header. Vendor strings appearing in the page body are deliberately NOT used as a signal — a page that merely mentions a vendor's name (for example in marketing copy) must not be reported as protected by that vendor's WAF.</w:t>
       </w:r>
     </w:p>
     <w:p>
@@ -3240,17 +3256,17 @@
         <w:spacing w:after="40"/>
       </w:pPr>
       <w:r>
-        <w:t>Sucuri -- Detected via x-sucuri-id header, x-sucuri-cache header, and body content.</w:t>
-      </w:r>
-    </w:p>
-    <w:p>
-      <w:pPr>
-        <w:pStyle w:val="ListParagraph"/>
-        <w:widowControl/>
-        <w:spacing w:after="40"/>
-      </w:pPr>
-      <w:r>
-        <w:t>F5 BIG-IP ASM -- Detected via proprietary headers and F5 session cookies.</w:t>
+        <w:t>Sucuri -- Detected via x-sucuri-id and x-sucuri-cache headers.</w:t>
+      </w:r>
+    </w:p>
+    <w:p>
+      <w:pPr>
+        <w:pStyle w:val="ListParagraph"/>
+        <w:widowControl/>
+        <w:spacing w:after="40"/>
+      </w:pPr>
+      <w:r>
+        <w:t>F5 BIG-IP ASM -- Detected only via genuine F5 markers: the x-wa-info header, BIG-IP / TS01 / F5 session cookies, or a Server: BIG-IP header. The ubiquitous x-frame-options header is NOT treated as an F5 signal, as almost any hardened site sets it.</w:t>
       </w:r>
     </w:p>
     <w:p>
@@ -4053,7 +4069,7 @@
         <w:spacing w:after="40"/>
       </w:pPr>
       <w:r>
-        <w:t>The scanner checks up to 40 common DKIM selector names to locate your published key.</w:t>
+        <w:t>The scanner checks up to 40 common DKIM selector names to locate your published key. A selector is only counted as a real DKIM record when its TXT value actually contains a DKIM key — that is, a v=DKIM1 tag or a p= public-key tag. A selector name that merely resolves (for example, because the domain uses a DNS wildcard) but carries no key is ignored, so a wildcard cannot inflate the DKIM result with non-existent selectors.</w:t>
       </w:r>
     </w:p>
     <w:p>
@@ -4603,7 +4619,22 @@
         <w:t xml:space="preserve">How It Works: </w:t>
       </w:r>
       <w:r>
-        <w:t>The scanner performs a TCP port scan against your domain’s resolved IP addresses, checking for commonly targeted services. Each discovered open port is classified into one of three risk tiers.</w:t>
+        <w:t>The scanner performs a TCP port scan against your domain’s resolved IP addresses, checking for commonly targeted services. Each discovered open port is classified into one of three risk tiers. When a domain resolves to (or has) more than one IP address, each exposed port is attributed in the report to the specific IP it was actually found on — so, for example, an open FTP port on a real origin server is shown against that origin's address rather than against the CDN edge address the domain name points to.</w:t>
+      </w:r>
+    </w:p>
+    <w:p>
+      <w:pPr>
+        <w:widowControl/>
+        <w:spacing w:after="80"/>
+      </w:pPr>
+      <w:r>
+        <w:rPr>
+          <w:b/>
+        </w:rPr>
+        <w:t xml:space="preserve">DNS Records Surfaced: </w:t>
+      </w:r>
+      <w:r>
+        <w:t>Alongside the port findings, the card surfaces the domain's core DNS posture: whether the zone is DNSSEC-signed (a DNSKEY present at the apex), whether AAAA (IPv6) records are published, and the domain's TXT records. DNSSEC status is shown explicitly so that a DNSSEC-related recommendation is always backed by a visible status in the same card.</w:t>
       </w:r>
     </w:p>
     <w:p>
@@ -5258,7 +5289,7 @@
         <w:t xml:space="preserve">VPN Gateway Detection: </w:t>
       </w:r>
       <w:r>
-        <w:t>The scanner identifies known VPN and remote access gateways by checking for characteristic ports, HTTP response headers, and TLS certificate attributes associated with common VPN solutions. Detected platforms include Citrix Gateway (NetScaler), Fortinet FortiGate, Pulse Secure (now Ivanti Connect Secure), Palo Alto GlobalProtect, Cisco AnyConnect, SonicWall, and WireGuard.</w:t>
+        <w:t>The scanner identifies known VPN and remote access gateways by checking for characteristic ports, HTTP response headers, and TLS certificate attributes associated with common VPN solutions. Detected platforms include Citrix Gateway (NetScaler), Fortinet FortiGate, Pulse Secure (now Ivanti Connect Secure), Palo Alto GlobalProtect, Cisco AnyConnect, SonicWall, and WireGuard. To avoid false positives, a vendor is only matched when a genuine vendor marker is returned over an HTTP 200 response that also passes a body-sanity check — a loose substring appearing in any response (such as a CDN challenge page or single-page-app shell) is not sufficient. This gate is applied uniformly to all of the supported gateways, including Microsoft RDS Web, which additionally requires genuine RDWeb tokens.</w:t>
       </w:r>
     </w:p>
     <w:p>
@@ -5681,7 +5712,7 @@
         <w:t xml:space="preserve">How it works: </w:t>
       </w:r>
       <w:r>
-        <w:t>For IP-based checks, the scanner reverses the IP address octets and performs DNS A-record lookups against five major blacklists: Spamhaus ZEN (zen.spamhaus.org), SpamCop (bl.spamcop.net), SORBS (dnsbl.sorbs.net), Barracuda (b.barracudacentral.org), and UCEProtect (dnsbl-1.uceprotect.net). For domain-based checks, it queries Spamhaus DBL (dbl.spamhaus.org) and URIBL (uribl.com). A successful DNS resolution means the IP or domain is listed.</w:t>
+        <w:t>For IP-based checks, the scanner reverses the IP address octets and performs DNS A-record lookups against four major blacklists: Spamhaus ZEN (zen.spamhaus.org), SpamCop (bl.spamcop.net), Barracuda (b.barracudacentral.org), and UCEProtect (dnsbl-1.uceprotect.net). For domain-based checks, it queries Spamhaus DBL (dbl.spamhaus.org) and URIBL (uribl.com). A bare DNS resolution is not by itself treated as a listing: the scanner validates each reply against the list's documented return codes and only counts a genuine listing code (typically 127.0.0.2 and above). Error, blocked, and refused replies — Spamhaus open-resolver / rate-limit codes in the 127.255.255.x range and the URIBL 127.0.0.1 query-refused code — are explicitly rejected, so an infrastructure response is never mistaken for a blacklisting.</w:t>
       </w:r>
     </w:p>
     <w:p>
@@ -5740,7 +5771,7 @@
         <w:spacing w:after="40"/>
       </w:pPr>
       <w:r>
-        <w:t>Listed on dnsbl.sorbs.net — SORBS listings often indicate the IP is on a dynamic/residential range or has been an open relay.</w:t>
+        <w:t>Listed on dnsbl-1.uceprotect.net — UCEProtect listings often indicate the IP sits on a range with a poor sending reputation or has been an open relay.</w:t>
       </w:r>
     </w:p>
     <w:p>
@@ -5826,7 +5857,7 @@
         <w:t xml:space="preserve">How it works: </w:t>
       </w:r>
       <w:r>
-        <w:t>HTTPS GET requests are sent to each path with a four-second timeout and redirects disabled. Up to 15 paths are probed concurrently using a thread pool. An HTTP 200 response means the path is directly accessible — this is a confirmed exposure. For critical paths, HTTP 401 and 403 responses are also flagged because they confirm the path exists (a server that returns 403 on /.env has admitted the file is there, even if it is access-controlled). Non-critical paths only flag on HTTP 200.</w:t>
+        <w:t>HTTPS GET requests are sent to each path with a four-second timeout and redirects disabled. Up to 15 paths are probed concurrently using a thread pool. Only an HTTP 200 response that also passes a body-sanity check counts as an exposure — confirming the path is directly accessible and is serving real content rather than a generic landing or error page. HTTP 401 and 403 responses are treated as PROTECTED (access-controlled) and are NOT counted as findings: a server that returns 403 on /.env or /wp-admin is enforcing access control, which is the desired posture. This 200-only, body-checked approach mirrors the dependency-manifest probe and prevents WAF/CDN-defended sites from being penalised for blocking the probe.</w:t>
       </w:r>
     </w:p>
     <w:p>
@@ -5905,7 +5936,7 @@
         <w:spacing w:after="40"/>
       </w:pPr>
       <w:r>
-        <w:t>/.git/HEAD — HTTP 403: The Git repository metadata exists on the server. While blocked, its presence confirms a deployment practice that may expose source code if misconfigured.</w:t>
+        <w:t>/.git/HEAD — HTTP 200 (CRITICAL): The Git repository metadata is publicly readable, allowing an attacker to reconstruct the source tree. A path that instead returns 401/403 is reported as protected and does not appear as a finding.</w:t>
       </w:r>
     </w:p>
     <w:p>
@@ -5967,7 +5998,7 @@
         <w:t xml:space="preserve">What it checks: </w:t>
       </w:r>
       <w:r>
-        <w:t>The scanner discovers subdomains through two methods: Certificate Transparency (CT) log scanning via crt.sh and DNS brute-force resolution of 50+ common prefixes (www, mail, vpn, dev, staging, test, admin, api, beta, backup, jenkins, gitlab, jira, grafana, kibana, phpmyadmin, cpanel, owa, exchange, and many more). Discovered subdomains are classified as 'risky' if they contain keywords associated with development, administration, or internal infrastructure.</w:t>
+        <w:t>The scanner discovers subdomains through two methods. Certificate Transparency (CT) log scanning via crt.sh is the PRIMARY source — it reveals every subdomain that has ever had a public certificate issued. DNS brute-force resolution of 50+ common prefixes (www, mail, vpn, dev, staging, test, admin, api, beta, backup, jenkins, gitlab, jira, grafana, kibana, phpmyadmin, cpanel, owa, exchange, and many more) is the secondary source, used to catch subdomains that have no certificate. Discovered subdomains are classified as 'risky' when a risk keyword (dev, staging, admin, backup, etc.) appears as a distinct label — the apex itself and the ordinary www host are excluded from the risky count.</w:t>
       </w:r>
     </w:p>
     <w:p>
@@ -5982,7 +6013,7 @@
         <w:t xml:space="preserve">How it works: </w:t>
       </w:r>
       <w:r>
-        <w:t>First, a query to crt.sh retrieves all certificates ever issued for the domain and its subdomains from public Certificate Transparency logs. This reveals subdomains the organisation may have forgotten about — old staging servers, decommissioned APIs, and test environments. Second, the scanner resolves each of the 50+ brute-force prefixes via DNS to catch subdomains that may not have certificates. Each discovered subdomain is tagged with risk keywords (dev, staging, test, admin, backup, database, internal, vpn, etc.).</w:t>
+        <w:t>First, a query to crt.sh retrieves all certificates ever issued for the domain and its subdomains from public Certificate Transparency logs (the query is retried once before giving up). This reveals subdomains the organisation may have forgotten about — old staging servers, decommissioned APIs, and test environments. The report only narrates results as discovered 'via Certificate Transparency' when this crt.sh query actually succeeded; if CT is unavailable the card does not claim a CT source. Second, the scanner resolves each of the 50+ brute-force prefixes via DNS. Before doing so it runs a wildcard-DNS guard: two random non-existent labels are resolved, and if they answer (meaning *.domain is a catch-all wildcard) brute-force discovery is suppressed, because every guessed prefix would otherwise appear to resolve and fabricate subdomains that do not exist. Each genuinely discovered subdomain is tagged with risk keywords (dev, staging, test, admin, backup, database, internal, vpn, etc.).</w:t>
       </w:r>
     </w:p>
     <w:p>
@@ -6259,6 +6290,22 @@
     </w:p>
     <w:p>
       <w:pPr>
+        <w:widowControl/>
+        <w:spacing w:after="80"/>
+      </w:pPr>
+      <w:r>
+        <w:rPr>
+          <w:b/>
+          <w:color w:val="003399"/>
+        </w:rPr>
+        <w:t xml:space="preserve">NOTE: </w:t>
+      </w:r>
+      <w:r>
+        <w:t>Source-honesty: the free Shodan InternetDB path does not return ASN or hosting-country data, so when only InternetDB is available the card shows ASN and Country as 'not available' rather than inventing a placeholder count. Similarly, when OSV.dev reports a vulnerability with no real CVSS score, the severity is shown as estimated (derived from the database's own severity label) and flagged as such, rather than presenting a fabricated numeric CVSS.</w:t>
+      </w:r>
+    </w:p>
+    <w:p>
+      <w:pPr>
         <w:keepNext/>
         <w:widowControl/>
         <w:spacing w:after="80"/>
@@ -6793,6 +6840,21 @@
         <w:rPr>
           <w:b/>
         </w:rPr>
+        <w:t xml:space="preserve">Counting password-bearing records: </w:t>
+      </w:r>
+      <w:r>
+        <w:t>Where the assessment reports an exposed-credential count, it counts the records (mailboxes) that actually carry a password — the plaintext- and hashed-password subset from the Dehashed credential breakdown — rather than treating a single 'passwords present' indicator as if it were a count. The figure is therefore phrased so the reader can see both the total exposure and how much of it is directly loginable (for example, one mailbox carrying a password across thirteen breach-exposure records). Email addresses are lower-cased and trimmed before the unique-mailbox tally so that the same address in different letter cases is not double-counted.</w:t>
+      </w:r>
+    </w:p>
+    <w:p>
+      <w:pPr>
+        <w:widowControl/>
+        <w:spacing w:after="80"/>
+      </w:pPr>
+      <w:r>
+        <w:rPr>
+          <w:b/>
+        </w:rPr>
         <w:t xml:space="preserve">Risk levels and their meanings: </w:t>
       </w:r>
       <w:r>
@@ -7098,7 +7160,7 @@
         <w:t xml:space="preserve">What it checks: </w:t>
       </w:r>
       <w:r>
-        <w:t>The scanner generates lookalike domain permutations and checks which ones are registered and actively resolving via DNS. These lookalike domains can be used for phishing attacks targeting the organisation's employees, clients, and partners. The scanner employs eight generation techniques: character omission, adjacent character swap, character duplication, homoglyph substitution (visually similar characters like 'o' and '0', 'l' and '1'), adjacent-keyboard typos (fat-finger errors), TLD variants (e.g., .com to .net, .co, .io, .co.za), dot insertion, and hyphen insertion.</w:t>
+        <w:t>The scanner generates lookalike domain permutations and checks which ones are registered and actively resolving via DNS. These lookalike domains can be used for phishing attacks targeting the organisation's employees, clients, and partners. The scanner employs several generation techniques: character omission, adjacent character swap, character duplication, ASCII homoglyph substitution (visually similar characters like 'o' and '0', 'l' and '1'), adjacent-keyboard typos (fat-finger errors), TLD variants (e.g., .com to .net, .co, .io, .co.za), dot insertion, and hyphen insertion. It also generates a bounded set of IDN / homoglyph candidates — internationalised-domain lookalikes that substitute Unicode characters resembling Latin letters (e.g. a Cyrillic 'а' for an ASCII 'a') and are registered in their punycode (xn--) form. These are the hardest lookalikes for a human to spot in an address bar.</w:t>
       </w:r>
     </w:p>
     <w:p>
@@ -7113,7 +7175,7 @@
         <w:t xml:space="preserve">How it works: </w:t>
       </w:r>
       <w:r>
-        <w:t>First, the domain is split into its name and TLD components (handling multi-part TLDs like .co.za). The permutation engine generates all variants using the eight techniques above. For homoglyph substitution, the scanner uses a mapping of visually similar characters (a/4/@, b/d/6, e/3, i/1/l/!, o/0, s/5/$, etc.). For keyboard typos, it uses an adjacency map of QWERTY keyboard neighbours. TLD variants are checked across 17 common TLDs including .com, .net, .org, .co, .dev, .online, .io, .info, .co.za, and .africa. Each generated permutation is checked via DNS resolution — if it resolves, the domain is registered and active. Resolved domains are further checked for SSL certificates, which indicate the lookalike is actively being used (possibly for phishing with a convincing HTTPS connection). Each permutation includes a visual similarity percentage.</w:t>
+        <w:t>First, the domain is split into its name and TLD components (handling multi-part TLDs like .co.za). The permutation engine generates all variants using the techniques above. For ASCII homoglyph substitution, the scanner uses a mapping of visually similar characters (a/4/@, b/d/6, e/3, i/1/l/!, o/0, s/5/$, etc.). IDN / homoglyph candidates are built by swapping a Latin letter for a confusable Unicode character and encoding the result to its punycode (xn--) label, which is what actually appears in DNS; this set is deliberately bounded to keep the permutation space manageable. For keyboard typos, it uses an adjacency map of QWERTY keyboard neighbours. TLD variants are checked across 17 common TLDs including .com, .net, .org, .co, .dev, .online, .io, .info, .co.za, and .africa. Each generated permutation is checked via DNS resolution — if it resolves, the domain is registered and active. Resolved domains are further checked for SSL certificates, which indicate the lookalike is actively being used (possibly for phishing with a convincing HTTPS connection). Each permutation includes a visual similarity percentage.</w:t>
       </w:r>
     </w:p>
     <w:p>
@@ -7573,7 +7635,7 @@
         <w:t xml:space="preserve">What it checks: </w:t>
       </w:r>
       <w:r>
-        <w:t>WordPress-only. A cheap discriminator probes /wp-content/, /wp-login.php, and /wp-includes/; if none respond the checker reports 'skipped' (the site is not WordPress and the card does not render in the report). When WordPress is detected, the scanner enumerates 25 popular plugin slugs by HEADing /wp-content/plugins/&lt;slug&gt;/ and harvests version strings from /wp-content/plugins/&lt;slug&gt;/readme.txt via the 'Stable tag:' header.</w:t>
+        <w:t>WordPress-only. The checker first establishes a genuine WordPress fingerprint by probing /wp-content/, /wp-login.php, and /wp-includes/, guarded by a random-path catch-all test so a site that returns 200 for every URL (a soft-404 / SPA front end behind a CDN) is NOT mistaken for WordPress. If no genuine fingerprint is found the checker reports 'skipped' (the site is not WordPress and the card does not render in the report). Only when WordPress is confirmed does the scanner enumerate 25 popular plugin slugs by requesting /wp-content/plugins/&lt;slug&gt;/readme.txt; a plugin is counted only when that readme returns HTTP 200 AND passes a body-sanity check confirming it is a real plugin readme (not a generic page). Version strings are harvested from the readme's 'Stable tag:' header.</w:t>
       </w:r>
     </w:p>
     <w:p>
@@ -8080,7 +8142,16 @@
         <w:spacing w:after="80"/>
       </w:pPr>
       <w:r>
-        <w:t>The scanner maintains 29 end-of-life (EOL) software signatures that are checked against every detected component. A component is flagged as EOL when its version falls below the vendor's actively supported threshold. For example, jQuery versions below 3.x, PHP below 8.1, or WordPress major releases that no longer receive security updates.</w:t>
+        <w:t>The scanner maintains a curated end-of-life (EOL) software signature table — refreshed against endoflife.date — that is checked against every detected component. It spans the server-side and runtime stacks most commonly exposed in response headers: PHP, Node.js, Python, OpenSSL, Apache httpd, nginx, Microsoft IIS, Apache Tomcat/Coyote, and ASP.NET. Only branches that are genuinely past their vendor security-EOL date are listed (for example PHP 8.0 and below, OpenSSL 1.1.1 and below, or nginx 1.18 and below); still-supported branches are intentionally absent so they are not flagged.</w:t>
+      </w:r>
+    </w:p>
+    <w:p>
+      <w:pPr>
+        <w:widowControl/>
+        <w:spacing w:after="80"/>
+      </w:pPr>
+      <w:r>
+        <w:t>Version matching is anchored on a component boundary: the matched version token must be followed by a non-digit, so a signature for a branch such as 7.1 matches '7.1' but does NOT spuriously match a newer release like 7.10. This prevents a supported version from being mislabelled end-of-life because its version string happens to begin with an older branch number.</w:t>
       </w:r>
     </w:p>
     <w:p>

</xml_diff>

<commit_message>
Manual: bump to v2.0 (July 2026) + dated version history
The cover and Section 11 stayed frozen at v1.0 / April 2026 through 30+ content
revisions since the initial release. Bump the cover to Version 2.0 / July 2026,
and add a dated v2.0 entry to the Version History listing every substantive
change since v1.0 (2026-04-16 through 2026-07-03), each with its date: hybrid
model, FAIR overhaul + return-period views, cat-stack + validity notice, peer
benchmarking, supply-chain checker layer, cross-correlation, credential
disclosure/export, cat-model calibration, and the recent CT/CVE/VM reconcile +
readability pass. Also added the missing separator space to the v1.0 entry.
Rebuilt the .docx; em-dash count still 0.

Co-Authored-By: Claude Opus 4.8 <noreply@anthropic.com>
</commit_message>
<xml_diff>
--- a/security_scanner/Phishield_Cyber_Risk_Scanner_User_Manual.docx
+++ b/security_scanner/Phishield_Cyber_Risk_Scanner_User_Manual.docx
@@ -81,7 +81,7 @@
         <w:rPr>
           <w:sz w:val="22"/>
         </w:rPr>
-        <w:t>Version 1.0</w:t>
+        <w:t>Version 2.0</w:t>
       </w:r>
     </w:p>
     <w:p>
@@ -92,7 +92,7 @@
         <w:rPr>
           <w:sz w:val="22"/>
         </w:rPr>
-        <w:t>April 2026</w:t>
+        <w:t>July 2026</w:t>
       </w:r>
     </w:p>
     <w:p>
@@ -15777,10 +15777,154 @@
         <w:rPr>
           <w:b/>
         </w:rPr>
+        <w:t>v2.0: July 2026</w:t>
+      </w:r>
+      <w:r>
+        <w:t xml:space="preserve"> Major revision.</w:t>
+      </w:r>
+    </w:p>
+    <w:p>
+      <w:pPr>
+        <w:widowControl/>
+        <w:spacing w:after="80"/>
+      </w:pPr>
+      <w:r>
+        <w:t>This release brings the manual current with the scanner development delivered since the v1.0 initial release. The changes are listed below with the date each landed.</w:t>
+      </w:r>
+    </w:p>
+    <w:p>
+      <w:pPr>
+        <w:pStyle w:val="ListParagraph"/>
+        <w:widowControl/>
+        <w:spacing w:after="40"/>
+      </w:pPr>
+      <w:r>
+        <w:t>2026-07-03: Reconciled the manual against current scanner behaviour: dual-source Certificate Transparency subdomain enumeration (crt.sh and certspotter, with a low-coverage flag), CVE version-gating disclosure (CVEs shown as 'potential, unconfirmed' where the exact software version is not fingerprinted), and the production endpoint moved to the Google Cloud VM at veilguard.phishield.com/scanner. Includes a document-wide readability and punctuation pass.</w:t>
+      </w:r>
+    </w:p>
+    <w:p>
+      <w:pPr>
+        <w:pStyle w:val="ListParagraph"/>
+        <w:widowControl/>
+        <w:spacing w:after="40"/>
+      </w:pPr>
+      <w:r>
+        <w:t>2026-06-08: Catastrophe-model mid-market calibration: a revenue-band taper and a POPIA/ECTA-scoped regulatory fine floor, with cyber-band, SPF/DMARC and availability frequency and severity refinements.</w:t>
+      </w:r>
+    </w:p>
+    <w:p>
+      <w:pPr>
+        <w:pStyle w:val="ListParagraph"/>
+        <w:widowControl/>
+        <w:spacing w:after="40"/>
+      </w:pPr>
+      <w:r>
+        <w:t>2026-06-05: Catastrophe-model redesign and FAIR reporting-card pass, with email-security accuracy improvements.</w:t>
+      </w:r>
+    </w:p>
+    <w:p>
+      <w:pPr>
+        <w:pStyle w:val="ListParagraph"/>
+        <w:widowControl/>
+        <w:spacing w:after="40"/>
+      </w:pPr>
+      <w:r>
+        <w:t>2026-06-02: Credential-exposure correlation now counts password-bearing records specifically; the encrypted export gained recency clustering and leak-reference confidence; the manual was brought current with the Waves 1 to 6 behavioural changes.</w:t>
+      </w:r>
+    </w:p>
+    <w:p>
+      <w:pPr>
+        <w:pStyle w:val="ListParagraph"/>
+        <w:widowControl/>
+        <w:spacing w:after="40"/>
+      </w:pPr>
+      <w:r>
+        <w:t>2026-06-01: Added the sensitive-credential disclosure tiers and the encrypted credential export (Section 6.4).</w:t>
+      </w:r>
+    </w:p>
+    <w:p>
+      <w:pPr>
+        <w:pStyle w:val="ListParagraph"/>
+        <w:widowControl/>
+        <w:spacing w:after="40"/>
+      </w:pPr>
+      <w:r>
+        <w:t>2026-05-29: Documented RDP and origin-discovery handling, the B2C and PCI regulatory flags, and the P50 headline correction.</w:t>
+      </w:r>
+    </w:p>
+    <w:p>
+      <w:pPr>
+        <w:pStyle w:val="ListParagraph"/>
+        <w:widowControl/>
+        <w:spacing w:after="40"/>
+      </w:pPr>
+      <w:r>
+        <w:t>2026-05-28: Added the Hudson Rock, S-4 and S-5 cross-correlation, scoped as reporting-only so it does not double-count in scoring.</w:t>
+      </w:r>
+    </w:p>
+    <w:p>
+      <w:pPr>
+        <w:pStyle w:val="ListParagraph"/>
+        <w:widowControl/>
+        <w:spacing w:after="40"/>
+      </w:pPr>
+      <w:r>
+        <w:t>2026-05-27: Added the supply-chain checker layer (related domains, third-party JavaScript, exposed dependency manifests, email-vendor surface, vendor-breach correlation, and CMS plugin surface); removed the earlier catastrophe-tail double-count; folded in the Q&amp;A audit fixes.</w:t>
+      </w:r>
+    </w:p>
+    <w:p>
+      <w:pPr>
+        <w:pStyle w:val="ListParagraph"/>
+        <w:widowControl/>
+        <w:spacing w:after="40"/>
+      </w:pPr>
+      <w:r>
+        <w:t>2026-05-18: Documented the WAF partial-coverage adjustment.</w:t>
+      </w:r>
+    </w:p>
+    <w:p>
+      <w:pPr>
+        <w:pStyle w:val="ListParagraph"/>
+        <w:widowControl/>
+        <w:spacing w:after="40"/>
+      </w:pPr>
+      <w:r>
+        <w:t>2026-05-15: FAIR financial-impact overhaul: 1-in-50, 1-in-100 and 1-in-150 return-period worst-case views, the sector regulatory catastrophe stack, and FAIS-safe 'Loss Exposure Scenarios' disclosure. Added the records-based Cat Modelling Validity Notice, peer benchmarking with a 1.0 to 10.0 peer rating, the WAF-friendly HTTP architecture, and the auto-detect to broker to cat-stack input flow.</w:t>
+      </w:r>
+    </w:p>
+    <w:p>
+      <w:pPr>
+        <w:pStyle w:val="ListParagraph"/>
+        <w:widowControl/>
+        <w:spacing w:after="40"/>
+      </w:pPr>
+      <w:r>
+        <w:t>2026-04-20: Regenerated for the hybrid financial-impact model, sub-industry selection, and GDPR and PCI inputs.</w:t>
+      </w:r>
+    </w:p>
+    <w:p>
+      <w:pPr>
+        <w:pStyle w:val="ListParagraph"/>
+        <w:widowControl/>
+        <w:spacing w:after="40"/>
+      </w:pPr>
+      <w:r>
+        <w:t>2026-04-16: Hybrid financial-impact model engine rewrite.</w:t>
+      </w:r>
+    </w:p>
+    <w:p>
+      <w:pPr>
+        <w:widowControl/>
+        <w:spacing w:after="80"/>
+      </w:pPr>
+      <w:r>
+        <w:rPr>
+          <w:b/>
+        </w:rPr>
         <w:t>v1.0: April 2026</w:t>
       </w:r>
       <w:r>
-        <w:t>Initial Release</w:t>
+        <w:t xml:space="preserve"> Initial Release</w:t>
       </w:r>
     </w:p>
     <w:p>

</xml_diff>

<commit_message>
Docs: record the adversarial scenarios, report card and measured cost (SCN-041)
Gap Analysis SCN-041 no longer lists adversarial scenarios, the PDF section and
per-scan cost as open, since all three shipped: 17 gate scenarios (40 -> 57) with
the fail-without-fix proof, the Breach History report card and its unconditional
unassessed caveat, and the measured cost (quick R0.30 / deep R0.31 per lookup,
grounding ~87% of it, hence deep as the default).

Manual 4.6.1 gains "Where it appears in the outputs" so a broker knows the full
report and the dashboard both carry the card, and that an unassessed result
survives into the client-facing document as a caveat rather than a clean result.

Both .docx regenerated and verified.

Co-Authored-By: Claude Opus 4.8 <noreply@anthropic.com>
</commit_message>
<xml_diff>
--- a/security_scanner/Phishield_Cyber_Risk_Scanner_User_Manual.docx
+++ b/security_scanner/Phishield_Cyber_Risk_Scanner_User_Manual.docx
@@ -5768,6 +5768,21 @@
       </w:r>
       <w:r>
         <w:t>If the research cannot run, the breach history is reported as UNASSESSED and contributes nothing to the score. It is never reported as clean. An absence of evidence produced by an outage is not evidence of absence, and the distinction is visible on both the scan form and the report.</w:t>
+      </w:r>
+    </w:p>
+    <w:p>
+      <w:pPr>
+        <w:widowControl/>
+        <w:spacing w:after="80"/>
+      </w:pPr>
+      <w:r>
+        <w:rPr>
+          <w:b/>
+        </w:rPr>
+        <w:t xml:space="preserve">Where it appears in the outputs: </w:t>
+      </w:r>
+      <w:r>
+        <w:t>The full technical report opens the Exposure and Reputation section with a Breach History card carrying the verdict, the date of the most recent incident and how long ago it was, each dated incident with the records affected and root cause where the sources state them, and the sources cited. The interactive dashboard carries the same panel at the top of the Exposure page. Where the research could not run, both render the unassessed state with an explicit caveat rather than a clean result, so the distinction survives into the client-facing document.</w:t>
       </w:r>
     </w:p>
     <w:p>

</xml_diff>